<commit_message>
Sprint 7: cartões de lista com altura fixa e Ver todos (revisão das telas)
</commit_message>
<xml_diff>
--- a/sprints/sprint-7/BuscaPet-Sprint7.docx
+++ b/sprints/sprint-7/BuscaPet-Sprint7.docx
@@ -1519,7 +1519,7 @@
       <w:r>
         <w:drawing>
           <wp:inline xmlns:a="http://schemas.openxmlformats.org/drawingml/2006/main" xmlns:pic="http://schemas.openxmlformats.org/drawingml/2006/picture">
-            <wp:extent cx="4500000" cy="7035000"/>
+            <wp:extent cx="4500000" cy="7672500"/>
             <wp:docPr id="5" name="Picture 5"/>
             <wp:cNvGraphicFramePr>
               <a:graphicFrameLocks noChangeAspect="1"/>
@@ -1540,7 +1540,7 @@
                   <pic:spPr>
                     <a:xfrm>
                       <a:off x="0" y="0"/>
-                      <a:ext cx="4500000" cy="7035000"/>
+                      <a:ext cx="4500000" cy="7672500"/>
                     </a:xfrm>
                     <a:prstGeom prst="rect"/>
                   </pic:spPr>
@@ -1563,6 +1563,47 @@
           <w:sz w:val="18"/>
         </w:rPr>
         <w:t>Figura 5 — Relatório do Abrigo Patinhas Felizes nos últimos 90 dias</w:t>
+      </w:r>
+    </w:p>
+    <w:p>
+      <w:pPr>
+        <w:spacing w:after="120" w:line="276" w:lineRule="auto"/>
+      </w:pPr>
+      <w:r>
+        <w:rPr>
+          <w:b/>
+        </w:rPr>
+        <w:t>Listas longas.</w:t>
+      </w:r>
+      <w:r>
+        <w:t xml:space="preserve"> Numa situação real, as listas de cidades, apoiadores e itens podem ter dezenas de linhas. Para a página não crescer sem limite nem carregar tudo de uma vez, cada cartão tem </w:t>
+      </w:r>
+      <w:r>
+        <w:rPr>
+          <w:b/>
+        </w:rPr>
+        <w:t>altura fixa</w:t>
+      </w:r>
+      <w:r>
+        <w:t xml:space="preserve"> e mostra só as </w:t>
+      </w:r>
+      <w:r>
+        <w:rPr>
+          <w:b/>
+        </w:rPr>
+        <w:t>5 primeiras</w:t>
+      </w:r>
+      <w:r>
+        <w:t xml:space="preserve"> linhas (nomes longos com reticências; o nome inteiro aparece ao passar o mouse). Quando há mais, o botão </w:t>
+      </w:r>
+      <w:r>
+        <w:rPr>
+          <w:b/>
+        </w:rPr>
+        <w:t>"Ver todos (N)"</w:t>
+      </w:r>
+      <w:r>
+        <w:t xml:space="preserve"> abre uma janela que busca a lista completa naquele momento, de 20 em 20 ("Carregar mais"). A API manda no relatório só as 5 primeiras linhas e o total de cada lista, e a lista completa vem de uma rota própria, em páginas. Esse ajuste veio da revisão das telas feita pela equipe.</w:t>
       </w:r>
     </w:p>
     <w:p>
@@ -5013,7 +5054,7 @@
                 <w:sz w:val="19"/>
                 <w:szCs w:val="19"/>
               </w:rPr>
-              <w:t xml:space="preserve">125 passando (14 novos: histórico, filtros, pesquisa, painel, relatório, CSV, permissões); ruff sem avisos</w:t>
+              <w:t xml:space="preserve">126 passando (15 novos: histórico, filtros, pesquisa, painel, relatório, listas em páginas, CSV, permissões); ruff sem avisos</w:t>
             </w:r>
           </w:p>
         </w:tc>
@@ -5080,7 +5121,7 @@
                 <w:sz w:val="19"/>
                 <w:szCs w:val="19"/>
               </w:rPr>
-              <w:t xml:space="preserve">66 de 66 passando (6 novos: painel e tabela, histórico com filtro e exportação, pesquisa de contas, relatório do abrigo com exportação, filtro de período)</w:t>
+              <w:t xml:space="preserve">67 de 67 passando (7 novos: painel e tabela, histórico com filtro e exportação, pesquisa de contas, relatório do abrigo com exportação, filtro de período, "Ver todos" das listas longas)</w:t>
             </w:r>
           </w:p>
         </w:tc>
@@ -6444,6 +6485,73 @@
                 <w:szCs w:val="19"/>
               </w:rPr>
               <w:t xml:space="preserve">Documentação no CONTEXTO e no README</w:t>
+            </w:r>
+          </w:p>
+        </w:tc>
+      </w:tr>
+      <w:tr>
+        <w:trPr>
+          <w:cantSplit/>
+        </w:trPr>
+        <w:tc>
+          <w:tcPr>
+            <w:tcW w:type="dxa" w:w="1701"/>
+            <w:tcBorders>
+              <w:top w:val="single" w:color="BFBFBF" w:sz="4"/>
+              <w:left w:val="single" w:color="BFBFBF" w:sz="4"/>
+              <w:bottom w:val="single" w:color="BFBFBF" w:sz="4"/>
+              <w:right w:val="single" w:color="BFBFBF" w:sz="4"/>
+            </w:tcBorders>
+            <w:tcMar>
+              <w:top w:type="dxa" w:w="60"/>
+              <w:left w:type="dxa" w:w="100"/>
+              <w:bottom w:type="dxa" w:w="60"/>
+              <w:right w:type="dxa" w:w="100"/>
+            </w:tcMar>
+            <w:vAlign w:val="center"/>
+          </w:tcPr>
+          <w:p>
+            <w:pPr>
+              <w:spacing w:after="0"/>
+            </w:pPr>
+            <w:r>
+              <w:rPr>
+                <w:rFonts w:ascii="Consolas" w:hAnsi="Consolas" w:cs="Consolas"/>
+                <w:sz w:val="17"/>
+                <w:szCs w:val="17"/>
+                <w:b/>
+              </w:rPr>
+              <w:t xml:space="preserve">e872860</w:t>
+            </w:r>
+          </w:p>
+        </w:tc>
+        <w:tc>
+          <w:tcPr>
+            <w:tcW w:type="dxa" w:w="7938"/>
+            <w:tcBorders>
+              <w:top w:val="single" w:color="BFBFBF" w:sz="4"/>
+              <w:left w:val="single" w:color="BFBFBF" w:sz="4"/>
+              <w:bottom w:val="single" w:color="BFBFBF" w:sz="4"/>
+              <w:right w:val="single" w:color="BFBFBF" w:sz="4"/>
+            </w:tcBorders>
+            <w:tcMar>
+              <w:top w:type="dxa" w:w="60"/>
+              <w:left w:type="dxa" w:w="100"/>
+              <w:bottom w:type="dxa" w:w="60"/>
+              <w:right w:type="dxa" w:w="100"/>
+            </w:tcMar>
+            <w:vAlign w:val="center"/>
+          </w:tcPr>
+          <w:p>
+            <w:pPr>
+              <w:spacing w:after="0"/>
+            </w:pPr>
+            <w:r>
+              <w:rPr>
+                <w:sz w:val="19"/>
+                <w:szCs w:val="19"/>
+              </w:rPr>
+              <w:t xml:space="preserve">Cartões de lista com altura fixa e lista completa sob demanda (revisão das telas)</w:t>
             </w:r>
           </w:p>
         </w:tc>

</xml_diff>